<commit_message>
paper: fix DOCX portal-ingestion failure — Jul 8 rebuild skipped the pdf->png figure swap (embedded PDF media); rebuild both DOCX and add build_docx.sh so the swap can't be forgotten again
</commit_message>
<xml_diff>
--- a/paper/symmc-flow_SI.docx
+++ b/paper/symmc-flow_SI.docx
@@ -158,7 +158,10 @@
         <w:t xml:space="preserve">diffusion</w:t>
       </w:r>
       <w:r>
-        <w:t xml:space="preserve">(Jiao et al. 2023)</w:t>
+        <w:rPr>
+          <w:vertAlign w:val="superscript"/>
+        </w:rPr>
+        <w:t xml:space="preserve">1</w:t>
       </w:r>
       <w:r>
         <w:t xml:space="preserve"> </w:t>
@@ -255,7 +258,10 @@
         <w:t xml:space="preserve">matches the reference under StructureMatcher</w:t>
       </w:r>
       <w:r>
-        <w:t xml:space="preserve">(Ong et al. 2013)</w:t>
+        <w:rPr>
+          <w:vertAlign w:val="superscript"/>
+        </w:rPr>
+        <w:t xml:space="preserve">2</w:t>
       </w:r>
       <w:r>
         <w:t xml:space="preserve">. SymMC-Flow</w:t>
@@ -393,7 +399,10 @@
         <w:t xml:space="preserve">SymMC-Flow versus a diffusion baseline</w:t>
       </w:r>
       <w:r>
-        <w:t xml:space="preserve">(Jiao et al. 2023)</w:t>
+        <w:rPr>
+          <w:vertAlign w:val="superscript"/>
+        </w:rPr>
+        <w:t xml:space="preserve">1</w:t>
       </w:r>
       <w:r>
         <w:t xml:space="preserve"> </w:t>
@@ -444,7 +453,7 @@
         <w:tblStyle w:val="Table"/>
         <w:tblW w:type="auto" w:w="0"/>
         <w:tblLook w:firstRow="1" w:lastRow="0" w:firstColumn="0" w:lastColumn="0" w:noHBand="0" w:noVBand="0" w:val="0020"/>
-        <w:tblCaption w:val="SymMC-Flow versus a diffusion baseline(Jiao et al. 2023) on single-block inorganic CSP under a matched evaluation (256 targets, 20 samples, identical RMSD routine). Match rates in percent; higher is better. Each method wins two of the four cells."/>
+        <w:tblCaption w:val="SymMC-Flow versus a diffusion baseline1 on single-block inorganic CSP under a matched evaluation (256 targets, 20 samples, identical RMSD routine). Match rates in percent; higher is better. Each method wins two of the four cells."/>
       </w:tblPr>
       <w:tblGrid>
         <w:gridCol w:w="1980"/>
@@ -759,7 +768,10 @@
         <w:t xml:space="preserve">variety</w:t>
       </w:r>
       <w:r>
-        <w:t xml:space="preserve">(Martirossyan et al. 2025)</w:t>
+        <w:rPr>
+          <w:vertAlign w:val="superscript"/>
+        </w:rPr>
+        <w:t xml:space="preserve">3</w:t>
       </w:r>
       <w:r>
         <w:t xml:space="preserve">. The numbers above should be read as a</w:t>
@@ -3534,16 +3546,10 @@
         <w:t xml:space="preserve">generators</w:t>
       </w:r>
       <w:r>
-        <w:t xml:space="preserve">(</w:t>
-      </w:r>
-      <w:r>
-        <w:t xml:space="preserve">Jin et al.</w:t>
-      </w:r>
-      <w:r>
-        <w:t xml:space="preserve"> </w:t>
-      </w:r>
-      <w:r>
-        <w:t xml:space="preserve">2025; Subramanian et al. 2026)</w:t>
+        <w:rPr>
+          <w:vertAlign w:val="superscript"/>
+        </w:rPr>
+        <w:t xml:space="preserve">4,5</w:t>
       </w:r>
       <w:r>
         <w:t xml:space="preserve">. It is trained on the same</w:t>
@@ -3785,16 +3791,10 @@
         <w:t xml:space="preserve">all-atom generators</w:t>
       </w:r>
       <w:r>
-        <w:t xml:space="preserve">(</w:t>
-      </w:r>
-      <w:r>
-        <w:t xml:space="preserve">Jin et al.</w:t>
-      </w:r>
-      <w:r>
-        <w:t xml:space="preserve"> </w:t>
-      </w:r>
-      <w:r>
-        <w:t xml:space="preserve">2025; Subramanian et al. 2026)</w:t>
+        <w:rPr>
+          <w:vertAlign w:val="superscript"/>
+        </w:rPr>
+        <w:t xml:space="preserve">4,5</w:t>
       </w:r>
       <w:r>
         <w:t xml:space="preserve"> </w:t>
@@ -4221,13 +4221,16 @@
         <w:pStyle w:val="Bibliography"/>
       </w:pPr>
       <w:r>
-        <w:t xml:space="preserve">Jiao, Rui, Wenbing Huang, Peijia Lin, et al. 2023.</w:t>
-      </w:r>
-      <w:r>
-        <w:t xml:space="preserve"> </w:t>
-      </w:r>
-      <w:r>
-        <w:t xml:space="preserve">“Crystal Structure Prediction by Joint Equivariant Diffusion.”</w:t>
+        <w:t xml:space="preserve">1</w:t>
+      </w:r>
+      <w:r>
+        <w:t xml:space="preserve"> </w:t>
+      </w:r>
+      <w:r>
+        <w:t xml:space="preserve">	</w:t>
+      </w:r>
+      <w:r>
+        <w:t xml:space="preserve">R. Jiao, W. Huang, P. Lin, J. Han, P. Chen, Y. Lu and Y. Liu, in</w:t>
       </w:r>
       <w:r>
         <w:t xml:space="preserve"> </w:t>
@@ -4237,35 +4240,96 @@
           <w:i/>
           <w:iCs/>
         </w:rPr>
-        <w:t xml:space="preserve">Advances in Neural Information Processing Systems (NeurIPS)</w:t>
-      </w:r>
-      <w:r>
-        <w:t xml:space="preserve">.</w:t>
+        <w:t xml:space="preserve">Advances in neural information processing systems (NeurIPS)</w:t>
+      </w:r>
+      <w:r>
+        <w:t xml:space="preserve">, 2023.</w:t>
       </w:r>
     </w:p>
     <w:bookmarkEnd w:id="26"/>
-    <w:bookmarkStart w:id="27" w:name="ref-jin2025oxtal"/>
+    <w:bookmarkStart w:id="28" w:name="ref-ong2013pymatgen"/>
     <w:p>
       <w:pPr>
         <w:pStyle w:val="Bibliography"/>
       </w:pPr>
       <w:r>
-        <w:t xml:space="preserve">Jin, Emily, Andrei Cristian Nica, Mikhail Galkin, et al.</w:t>
-      </w:r>
-      <w:r>
-        <w:t xml:space="preserve"> 2025.</w:t>
-      </w:r>
-      <w:r>
-        <w:t xml:space="preserve"> </w:t>
-      </w:r>
-      <w:r>
-        <w:t xml:space="preserve">“</w:t>
-      </w:r>
-      <w:r>
-        <w:t xml:space="preserve">OXtal</w:t>
-      </w:r>
-      <w:r>
-        <w:t xml:space="preserve">: An All-Atom Diffusion Model for Organic Crystal Structure Prediction.”</w:t>
+        <w:t xml:space="preserve">2</w:t>
+      </w:r>
+      <w:r>
+        <w:t xml:space="preserve"> </w:t>
+      </w:r>
+      <w:r>
+        <w:t xml:space="preserve">	</w:t>
+      </w:r>
+      <w:hyperlink r:id="rId27">
+        <w:r>
+          <w:rPr>
+            <w:rStyle w:val="Hyperlink"/>
+          </w:rPr>
+          <w:t xml:space="preserve">S. P. Ong, W. D. Richards, A. Jain, G. Hautier, M. Kocher, S. Cholia, D. Gunter, V. L. Chevrier, K. A. Persson and G. Ceder,</w:t>
+        </w:r>
+        <w:r>
+          <w:rPr>
+            <w:rStyle w:val="Hyperlink"/>
+          </w:rPr>
+          <w:t xml:space="preserve"> </w:t>
+        </w:r>
+        <w:r>
+          <w:rPr>
+            <w:rStyle w:val="Hyperlink"/>
+            <w:i/>
+            <w:iCs/>
+          </w:rPr>
+          <w:t xml:space="preserve">Computational Materials Science</w:t>
+        </w:r>
+        <w:r>
+          <w:rPr>
+            <w:rStyle w:val="Hyperlink"/>
+          </w:rPr>
+          <w:t xml:space="preserve">, 2013,</w:t>
+        </w:r>
+        <w:r>
+          <w:rPr>
+            <w:rStyle w:val="Hyperlink"/>
+          </w:rPr>
+          <w:t xml:space="preserve"> </w:t>
+        </w:r>
+        <w:r>
+          <w:rPr>
+            <w:rStyle w:val="Hyperlink"/>
+            <w:b/>
+            <w:bCs/>
+          </w:rPr>
+          <w:t xml:space="preserve">68</w:t>
+        </w:r>
+        <w:r>
+          <w:rPr>
+            <w:rStyle w:val="Hyperlink"/>
+          </w:rPr>
+          <w:t xml:space="preserve">, 314–319</w:t>
+        </w:r>
+      </w:hyperlink>
+      <w:r>
+        <w:t xml:space="preserve">.</w:t>
+      </w:r>
+    </w:p>
+    <w:bookmarkEnd w:id="28"/>
+    <w:bookmarkStart w:id="29" w:name="ref-martirossyan2025matching"/>
+    <w:p>
+      <w:pPr>
+        <w:pStyle w:val="Bibliography"/>
+      </w:pPr>
+      <w:r>
+        <w:t xml:space="preserve">3</w:t>
+      </w:r>
+      <w:r>
+        <w:t xml:space="preserve"> </w:t>
+      </w:r>
+      <w:r>
+        <w:t xml:space="preserve">	</w:t>
+      </w:r>
+      <w:r>
+        <w:t xml:space="preserve">M. M. Martirossyan, T. Egg, P. Hoellmer, G. Karypis, M. Transtrum, A. Roitberg, M. Liu, R. G. Hennig, E. B. Tadmor and S. Martiniani,</w:t>
       </w:r>
       <w:r>
         <w:t xml:space="preserve"> </w:t>
@@ -4275,26 +4339,32 @@
           <w:i/>
           <w:iCs/>
         </w:rPr>
-        <w:t xml:space="preserve">arXiv Preprint arXiv:2512.06987</w:t>
+        <w:t xml:space="preserve">arXiv preprint arXiv:2509.12178</w:t>
       </w:r>
       <w:r>
         <w:t xml:space="preserve">.</w:t>
       </w:r>
     </w:p>
-    <w:bookmarkEnd w:id="27"/>
-    <w:bookmarkStart w:id="28" w:name="ref-martirossyan2025matching"/>
+    <w:bookmarkEnd w:id="29"/>
+    <w:bookmarkStart w:id="30" w:name="ref-jin2025oxtal"/>
     <w:p>
       <w:pPr>
         <w:pStyle w:val="Bibliography"/>
       </w:pPr>
       <w:r>
-        <w:t xml:space="preserve">Martirossyan, Maya M., Thomas Egg, Philipp Hoellmer, et al. 2025.</w:t>
-      </w:r>
-      <w:r>
-        <w:t xml:space="preserve"> </w:t>
-      </w:r>
-      <w:r>
-        <w:t xml:space="preserve">“All That Structure Matches Does Not Glitter.”</w:t>
+        <w:t xml:space="preserve">4</w:t>
+      </w:r>
+      <w:r>
+        <w:t xml:space="preserve"> </w:t>
+      </w:r>
+      <w:r>
+        <w:t xml:space="preserve">	</w:t>
+      </w:r>
+      <w:r>
+        <w:t xml:space="preserve">E. Jin, A. C. Nica, M. Galkin and others</w:t>
+      </w:r>
+      <w:r>
+        <w:t xml:space="preserve">,</w:t>
       </w:r>
       <w:r>
         <w:t xml:space="preserve"> </w:t>
@@ -4304,54 +4374,8 @@
           <w:i/>
           <w:iCs/>
         </w:rPr>
-        <w:t xml:space="preserve">arXiv Preprint arXiv:2509.12178</w:t>
-      </w:r>
-      <w:r>
-        <w:t xml:space="preserve">.</w:t>
-      </w:r>
-    </w:p>
-    <w:bookmarkEnd w:id="28"/>
-    <w:bookmarkStart w:id="30" w:name="ref-ong2013pymatgen"/>
-    <w:p>
-      <w:pPr>
-        <w:pStyle w:val="Bibliography"/>
-      </w:pPr>
-      <w:r>
-        <w:t xml:space="preserve">Ong, Shyue Ping, William Davidson Richards, Anubhav Jain, et al. 2013.</w:t>
-      </w:r>
-      <w:r>
-        <w:t xml:space="preserve"> </w:t>
-      </w:r>
-      <w:r>
-        <w:t xml:space="preserve">“Python Materials Genomics (Pymatgen): A Robust, Open-Source Python Library for Materials Analysis.”</w:t>
-      </w:r>
-      <w:r>
-        <w:t xml:space="preserve"> </w:t>
-      </w:r>
-      <w:r>
-        <w:rPr>
-          <w:i/>
-          <w:iCs/>
-        </w:rPr>
-        <w:t xml:space="preserve">Computational Materials Science</w:t>
-      </w:r>
-      <w:r>
-        <w:t xml:space="preserve"> </w:t>
-      </w:r>
-      <w:r>
-        <w:t xml:space="preserve">68: 314–19.</w:t>
-      </w:r>
-      <w:r>
-        <w:t xml:space="preserve"> </w:t>
-      </w:r>
-      <w:hyperlink r:id="rId29">
-        <w:r>
-          <w:rPr>
-            <w:rStyle w:val="Hyperlink"/>
-          </w:rPr>
-          <w:t xml:space="preserve">https://doi.org/10.1016/j.commatsci.2012.10.028</w:t>
-        </w:r>
-      </w:hyperlink>
+        <w:t xml:space="preserve">arXiv preprint arXiv:2512.06987</w:t>
+      </w:r>
       <w:r>
         <w:t xml:space="preserve">.</w:t>
       </w:r>
@@ -4363,19 +4387,16 @@
         <w:pStyle w:val="Bibliography"/>
       </w:pPr>
       <w:r>
-        <w:t xml:space="preserve">Subramanian, Akshay, Elton Pan, Juno Nam, et al. 2026.</w:t>
-      </w:r>
-      <w:r>
-        <w:t xml:space="preserve"> </w:t>
-      </w:r>
-      <w:r>
-        <w:t xml:space="preserve">“</w:t>
-      </w:r>
-      <w:r>
-        <w:t xml:space="preserve">PackFlow</w:t>
-      </w:r>
-      <w:r>
-        <w:t xml:space="preserve">: Generative Molecular Crystal Structure Prediction via Reinforcement Learning Alignment.”</w:t>
+        <w:t xml:space="preserve">5</w:t>
+      </w:r>
+      <w:r>
+        <w:t xml:space="preserve"> </w:t>
+      </w:r>
+      <w:r>
+        <w:t xml:space="preserve">	</w:t>
+      </w:r>
+      <w:r>
+        <w:t xml:space="preserve">A. Subramanian, E. Pan, J. Nam, M. Weiler, S. Qu, C. W. Park, T. S. Jaakkola, E. Olivetti and R. Gomez-Bombarelli,</w:t>
       </w:r>
       <w:r>
         <w:t xml:space="preserve"> </w:t>
@@ -4385,7 +4406,7 @@
           <w:i/>
           <w:iCs/>
         </w:rPr>
-        <w:t xml:space="preserve">arXiv Preprint arXiv:2602.20140</w:t>
+        <w:t xml:space="preserve">arXiv preprint arXiv:2602.20140</w:t>
       </w:r>
       <w:r>
         <w:t xml:space="preserve">.</w:t>

</xml_diff>